<commit_message>
Schéma du flux « AC - Traiter un dépôt » (JPEG, PNG) intégré au guide 5
Co-Authored-By: Claude Opus 5.5 <noreply@anthropic.com>
Claude-Session: https://claude.ai/code/session_01FRdAzq8p3F9gJJe5MA3G79
</commit_message>
<xml_diff>
--- a/sharepoint-html-kit/appreciation/5-GUIDE-FLUX-DEPOT.docx
+++ b/sharepoint-html-kit/appreciation/5-GUIDE-FLUX-DEPOT.docx
@@ -2,7 +2,7 @@
 <file path=word/document.xml><?xml version="1.0" encoding="utf-8"?>
 <w:document xmlns:w="http://schemas.openxmlformats.org/wordprocessingml/2006/main" xmlns:m="http://schemas.openxmlformats.org/officeDocument/2006/math" xmlns:r="http://schemas.openxmlformats.org/officeDocument/2006/relationships" xmlns:o="urn:schemas-microsoft-com:office:office" xmlns:v="urn:schemas-microsoft-com:vml" xmlns:w10="urn:schemas-microsoft-com:office:word" xmlns:a="http://schemas.openxmlformats.org/drawingml/2006/main" xmlns:pic="http://schemas.openxmlformats.org/drawingml/2006/picture" xmlns:wp="http://schemas.openxmlformats.org/drawingml/2006/wordprocessingDrawing">
   <w:body>
-    <w:bookmarkStart w:id="31" w:name="Xf95723f973c9375d66ebfaeb9f6340836421c15"/>
+    <w:bookmarkStart w:id="34" w:name="Xf95723f973c9375d66ebfaeb9f6340836421c15"/>
     <w:p>
       <w:pPr>
         <w:pStyle w:val="Heading1"/>
@@ -113,7 +113,7 @@
         </w:pict>
       </w:r>
     </w:p>
-    <w:bookmarkStart w:id="20" w:name="ce-que-fait-le-flux"/>
+    <w:bookmarkStart w:id="23" w:name="ce-que-fait-le-flux"/>
     <w:p>
       <w:pPr>
         <w:pStyle w:val="Heading2"/>
@@ -124,7 +124,96 @@
     </w:p>
     <w:p>
       <w:pPr>
-        <w:pStyle w:val="FirstParagraph"/>
+        <w:pStyle w:val="CaptionedFigure"/>
+      </w:pPr>
+      <w:r>
+        <w:drawing>
+          <wp:inline>
+            <wp:extent cx="5334000" cy="7140448"/>
+            <wp:effectExtent b="0" l="0" r="0" t="0"/>
+            <wp:docPr descr="Schéma du flux « AC - Traiter un dépôt »" title="" id="21" name="Picture"/>
+            <a:graphic>
+              <a:graphicData uri="http://schemas.openxmlformats.org/drawingml/2006/picture">
+                <pic:pic>
+                  <pic:nvPicPr>
+                    <pic:cNvPr descr="modeles/schema-flux.png" id="22" name="Picture"/>
+                    <pic:cNvPicPr>
+                      <a:picLocks noChangeArrowheads="1" noChangeAspect="1"/>
+                    </pic:cNvPicPr>
+                  </pic:nvPicPr>
+                  <pic:blipFill>
+                    <a:blip r:embed="rId20"/>
+                    <a:stretch>
+                      <a:fillRect/>
+                    </a:stretch>
+                  </pic:blipFill>
+                  <pic:spPr bwMode="auto">
+                    <a:xfrm>
+                      <a:off x="0" y="0"/>
+                      <a:ext cx="5334000" cy="7140448"/>
+                    </a:xfrm>
+                    <a:prstGeom prst="rect">
+                      <a:avLst/>
+                    </a:prstGeom>
+                    <a:noFill/>
+                    <a:ln w="9525">
+                      <a:noFill/>
+                      <a:headEnd/>
+                      <a:tailEnd/>
+                    </a:ln>
+                  </pic:spPr>
+                </pic:pic>
+              </a:graphicData>
+            </a:graphic>
+          </wp:inline>
+        </w:drawing>
+      </w:r>
+    </w:p>
+    <w:p>
+      <w:pPr>
+        <w:pStyle w:val="ImageCaption"/>
+      </w:pPr>
+      <w:r>
+        <w:t xml:space="preserve">Schéma du flux « AC - Traiter un dépôt »</w:t>
+      </w:r>
+    </w:p>
+    <w:p>
+      <w:pPr>
+        <w:pStyle w:val="BodyText"/>
+      </w:pPr>
+      <w:r>
+        <w:rPr>
+          <w:iCs/>
+          <w:i/>
+        </w:rPr>
+        <w:t xml:space="preserve">Le schéma est aussi fourni à part :</w:t>
+      </w:r>
+      <w:r>
+        <w:rPr>
+          <w:iCs/>
+          <w:i/>
+        </w:rPr>
+        <w:t xml:space="preserve"> </w:t>
+      </w:r>
+      <w:r>
+        <w:rPr>
+          <w:rStyle w:val="VerbatimChar"/>
+          <w:iCs/>
+          <w:i/>
+        </w:rPr>
+        <w:t xml:space="preserve">modeles/schema-flux.jpg</w:t>
+      </w:r>
+      <w:r>
+        <w:rPr>
+          <w:iCs/>
+          <w:i/>
+        </w:rPr>
+        <w:t xml:space="preserve">.</w:t>
+      </w:r>
+    </w:p>
+    <w:p>
+      <w:pPr>
+        <w:pStyle w:val="BodyText"/>
       </w:pPr>
       <w:r>
         <w:t xml:space="preserve">À chaque nouvel élément dans</w:t>
@@ -426,8 +515,8 @@
         <w:t xml:space="preserve">.</w:t>
       </w:r>
     </w:p>
-    <w:bookmarkEnd w:id="20"/>
-    <w:bookmarkStart w:id="21" w:name="avant-de-commencer"/>
+    <w:bookmarkEnd w:id="23"/>
+    <w:bookmarkStart w:id="24" w:name="avant-de-commencer"/>
     <w:p>
       <w:pPr>
         <w:pStyle w:val="Heading2"/>
@@ -620,8 +709,8 @@
         <w:t xml:space="preserve">.</w:t>
       </w:r>
     </w:p>
-    <w:bookmarkEnd w:id="21"/>
-    <w:bookmarkStart w:id="22" w:name="créer-le-flux-et-son-déclencheur"/>
+    <w:bookmarkEnd w:id="24"/>
+    <w:bookmarkStart w:id="25" w:name="créer-le-flux-et-son-déclencheur"/>
     <w:p>
       <w:pPr>
         <w:pStyle w:val="Heading2"/>
@@ -816,8 +905,8 @@
         <w:t xml:space="preserve">. Les dépôts sont ainsi traités un à la fois.</w:t>
       </w:r>
     </w:p>
-    <w:bookmarkEnd w:id="22"/>
-    <w:bookmarkStart w:id="23" w:name="Xc017f842a59bdf4b9811b33865f1bac2bea6751"/>
+    <w:bookmarkEnd w:id="25"/>
+    <w:bookmarkStart w:id="26" w:name="Xc017f842a59bdf4b9811b33865f1bac2bea6751"/>
     <w:p>
       <w:pPr>
         <w:pStyle w:val="Heading2"/>
@@ -1238,8 +1327,8 @@
         </w:tc>
       </w:tr>
     </w:tbl>
-    <w:bookmarkEnd w:id="23"/>
-    <w:bookmarkStart w:id="24" w:name="étendue-traitement-lire-le-dépôt"/>
+    <w:bookmarkEnd w:id="26"/>
+    <w:bookmarkStart w:id="27" w:name="étendue-traitement-lire-le-dépôt"/>
     <w:p>
       <w:pPr>
         <w:pStyle w:val="Heading2"/>
@@ -2049,8 +2138,8 @@
         <w:t xml:space="preserve">.</w:t>
       </w:r>
     </w:p>
-    <w:bookmarkEnd w:id="24"/>
-    <w:bookmarkStart w:id="25" w:name="X1522e769a449a9b99542651af4290cc4b909398"/>
+    <w:bookmarkEnd w:id="27"/>
+    <w:bookmarkStart w:id="28" w:name="X1522e769a449a9b99542651af4290cc4b909398"/>
     <w:p>
       <w:pPr>
         <w:pStyle w:val="Heading2"/>
@@ -2862,8 +2951,8 @@
         <w:t xml:space="preserve">- modèle « Avis au supérieur » de la section 8.</w:t>
       </w:r>
     </w:p>
-    <w:bookmarkEnd w:id="25"/>
-    <w:bookmarkStart w:id="26" w:name="X8be09f38b1f68f09cd825eab158f292f8f6ac2e"/>
+    <w:bookmarkEnd w:id="28"/>
+    <w:bookmarkStart w:id="29" w:name="X8be09f38b1f68f09cd825eab158f292f8f6ac2e"/>
     <w:p>
       <w:pPr>
         <w:pStyle w:val="Heading2"/>
@@ -4500,8 +4589,8 @@
         <w:t xml:space="preserve">utcNow()</w:t>
       </w:r>
     </w:p>
-    <w:bookmarkEnd w:id="26"/>
-    <w:bookmarkStart w:id="27" w:name="après-létendue-répondre-et-nettoyer"/>
+    <w:bookmarkEnd w:id="29"/>
+    <w:bookmarkStart w:id="30" w:name="après-létendue-répondre-et-nettoyer"/>
     <w:p>
       <w:pPr>
         <w:pStyle w:val="Heading2"/>
@@ -4917,8 +5006,8 @@
         <w:t xml:space="preserve">les cases.</w:t>
       </w:r>
     </w:p>
-    <w:bookmarkEnd w:id="27"/>
-    <w:bookmarkStart w:id="28" w:name="Xf00ff7754150d667c16f762d88d2a763dc1d03c"/>
+    <w:bookmarkEnd w:id="30"/>
+    <w:bookmarkStart w:id="31" w:name="Xf00ff7754150d667c16f762d88d2a763dc1d03c"/>
     <w:p>
       <w:pPr>
         <w:pStyle w:val="Heading2"/>
@@ -5165,8 +5254,8 @@
         <w:t xml:space="preserve">.</w:t>
       </w:r>
     </w:p>
-    <w:bookmarkEnd w:id="28"/>
-    <w:bookmarkStart w:id="29" w:name="Xebea96ffebc3922a93c2682a9c969f37294be1d"/>
+    <w:bookmarkEnd w:id="31"/>
+    <w:bookmarkStart w:id="32" w:name="Xebea96ffebc3922a93c2682a9c969f37294be1d"/>
     <w:p>
       <w:pPr>
         <w:pStyle w:val="Heading2"/>
@@ -5898,8 +5987,8 @@
         <w:t xml:space="preserve">. Faites ensuite un pilote avec 2 ou 3 vraies personnes (une personne en appréciation, son supérieur immédiat et son supérieur hiérarchique), toujours avec des données fictives. Le flux trouvera alors les supérieurs dans l’annuaire et vérifiera les vraies identités.</w:t>
       </w:r>
     </w:p>
-    <w:bookmarkEnd w:id="29"/>
-    <w:bookmarkStart w:id="30" w:name="X5312ca5aa9b12ee911cf015537d53aa7a5d2a6d"/>
+    <w:bookmarkEnd w:id="32"/>
+    <w:bookmarkStart w:id="33" w:name="X5312ca5aa9b12ee911cf015537d53aa7a5d2a6d"/>
     <w:p>
       <w:pPr>
         <w:pStyle w:val="Heading2"/>
@@ -6074,8 +6163,8 @@
         <w:t xml:space="preserve">Tests exigés par l’EFVP.</w:t>
       </w:r>
     </w:p>
-    <w:bookmarkEnd w:id="30"/>
-    <w:bookmarkEnd w:id="31"/>
+    <w:bookmarkEnd w:id="33"/>
+    <w:bookmarkEnd w:id="34"/>
     <w:sectPr/>
   </w:body>
 </w:document>

</xml_diff>

<commit_message>
Guide du flux : expression de l'action « Controle » (contenu collé ou pièce jointe)
Co-Authored-By: Claude Opus 5.5 <noreply@anthropic.com>
Claude-Session: https://claude.ai/code/session_01FRdAzq8p3F9gJJe5MA3G79
</commit_message>
<xml_diff>
--- a/sharepoint-html-kit/appreciation/5-GUIDE-FLUX-DEPOT.docx
+++ b/sharepoint-html-kit/appreciation/5-GUIDE-FLUX-DEPOT.docx
@@ -1955,6 +1955,209 @@
       </w:r>
       <w:r>
         <w:t xml:space="preserve">.</w:t>
+      </w:r>
+    </w:p>
+    <w:p>
+      <w:pPr>
+        <w:pStyle w:val="BodyText"/>
+      </w:pPr>
+      <w:r>
+        <w:rPr>
+          <w:bCs/>
+          <w:b/>
+        </w:rPr>
+        <w:t xml:space="preserve">4.4 (variante recommandée) — Composer</w:t>
+      </w:r>
+      <w:r>
+        <w:rPr>
+          <w:bCs/>
+          <w:b/>
+        </w:rPr>
+        <w:t xml:space="preserve"> </w:t>
+      </w:r>
+      <w:r>
+        <w:rPr>
+          <w:rStyle w:val="VerbatimChar"/>
+          <w:bCs/>
+          <w:b/>
+        </w:rPr>
+        <w:t xml:space="preserve">Controle</w:t>
+      </w:r>
+      <w:r>
+        <w:rPr>
+          <w:bCs/>
+          <w:b/>
+        </w:rPr>
+        <w:t xml:space="preserve">.</w:t>
+      </w:r>
+      <w:r>
+        <w:t xml:space="preserve"> </w:t>
+      </w:r>
+      <w:r>
+        <w:t xml:space="preserve">Elle remplace la condition</w:t>
+      </w:r>
+      <w:r>
+        <w:t xml:space="preserve"> </w:t>
+      </w:r>
+      <w:r>
+        <w:rPr>
+          <w:rStyle w:val="VerbatimChar"/>
+        </w:rPr>
+        <w:t xml:space="preserve">DepotValide</w:t>
+      </w:r>
+      <w:r>
+        <w:t xml:space="preserve"> </w:t>
+      </w:r>
+      <w:r>
+        <w:t xml:space="preserve">et donne une raison de refus précise. Expression, sur une seule ligne :</w:t>
+      </w:r>
+    </w:p>
+    <w:p>
+      <w:pPr>
+        <w:pStyle w:val="SourceCode"/>
+      </w:pPr>
+      <w:r>
+        <w:rPr>
+          <w:rStyle w:val="VerbatimChar"/>
+        </w:rPr>
+        <w:t xml:space="preserve">if(and(empty(coalesce(triggerBody()?['Contenu'],'')), not(equals(length(body('PJ')),1))), 'Collez le contenu du dépôt dans le champ « Contenu », ou joignez exactement UN fichier de dépôt.', if(not(equals(outputs('Depot')?['format'],'appreciation-depot-v1')), 'Ce contenu n''est pas un dépôt de l''application. Recommencez avec le bouton « Copier le contenu du dépôt ».', if(not(contains(createArray('sauvegarder','aviser','certifier','approuver'), coalesce(outputs('Depot')?['action'],''))), 'Action de dépôt inconnue.', if(empty(coalesce(outputs('Depot')?['dossierId'],'')), 'Le dépôt ne contient pas d''identifiant de dossier.', ''))))</w:t>
+      </w:r>
+    </w:p>
+    <w:p>
+      <w:pPr>
+        <w:pStyle w:val="FirstParagraph"/>
+      </w:pPr>
+      <w:r>
+        <w:t xml:space="preserve">Ensuite :</w:t>
+      </w:r>
+      <w:r>
+        <w:t xml:space="preserve"> </w:t>
+      </w:r>
+      <w:r>
+        <w:t xml:space="preserve">-</w:t>
+      </w:r>
+      <w:r>
+        <w:t xml:space="preserve"> </w:t>
+      </w:r>
+      <w:r>
+        <w:rPr>
+          <w:bCs/>
+          <w:b/>
+        </w:rPr>
+        <w:t xml:space="preserve">Définir une variable</w:t>
+      </w:r>
+      <w:r>
+        <w:t xml:space="preserve"> </w:t>
+      </w:r>
+      <w:r>
+        <w:rPr>
+          <w:rStyle w:val="VerbatimChar"/>
+        </w:rPr>
+        <w:t xml:space="preserve">motifRefus</w:t>
+      </w:r>
+      <w:r>
+        <w:t xml:space="preserve"> </w:t>
+      </w:r>
+      <w:r>
+        <w:t xml:space="preserve">=</w:t>
+      </w:r>
+      <w:r>
+        <w:t xml:space="preserve"> </w:t>
+      </w:r>
+      <w:r>
+        <w:rPr>
+          <w:rStyle w:val="VerbatimChar"/>
+        </w:rPr>
+        <w:t xml:space="preserve">outputs('Controle')</w:t>
+      </w:r>
+      <w:r>
+        <w:t xml:space="preserve"> </w:t>
+      </w:r>
+      <w:r>
+        <w:t xml:space="preserve">;</w:t>
+      </w:r>
+      <w:r>
+        <w:t xml:space="preserve"> </w:t>
+      </w:r>
+      <w:r>
+        <w:t xml:space="preserve">-</w:t>
+      </w:r>
+      <w:r>
+        <w:t xml:space="preserve"> </w:t>
+      </w:r>
+      <w:r>
+        <w:rPr>
+          <w:bCs/>
+          <w:b/>
+        </w:rPr>
+        <w:t xml:space="preserve">Condition</w:t>
+      </w:r>
+      <w:r>
+        <w:t xml:space="preserve"> </w:t>
+      </w:r>
+      <w:r>
+        <w:rPr>
+          <w:rStyle w:val="VerbatimChar"/>
+        </w:rPr>
+        <w:t xml:space="preserve">empty(variables('motifRefus'))</w:t>
+      </w:r>
+      <w:r>
+        <w:t xml:space="preserve">,</w:t>
+      </w:r>
+      <w:r>
+        <w:t xml:space="preserve"> </w:t>
+      </w:r>
+      <w:r>
+        <w:rPr>
+          <w:bCs/>
+          <w:b/>
+        </w:rPr>
+        <w:t xml:space="preserve">est égal à</w:t>
+      </w:r>
+      <w:r>
+        <w:t xml:space="preserve"> </w:t>
+      </w:r>
+      <w:r>
+        <w:rPr>
+          <w:rStyle w:val="VerbatimChar"/>
+        </w:rPr>
+        <w:t xml:space="preserve">true</w:t>
+      </w:r>
+      <w:r>
+        <w:t xml:space="preserve"> </w:t>
+      </w:r>
+      <w:r>
+        <w:t xml:space="preserve">: toutes les étapes suivantes vont dans la branche</w:t>
+      </w:r>
+      <w:r>
+        <w:t xml:space="preserve"> </w:t>
+      </w:r>
+      <w:r>
+        <w:rPr>
+          <w:bCs/>
+          <w:b/>
+        </w:rPr>
+        <w:t xml:space="preserve">Oui</w:t>
+      </w:r>
+      <w:r>
+        <w:t xml:space="preserve">.</w:t>
+      </w:r>
+    </w:p>
+    <w:p>
+      <w:pPr>
+        <w:pStyle w:val="BodyText"/>
+      </w:pPr>
+      <w:r>
+        <w:t xml:space="preserve">Les apostrophes doublées (</w:t>
+      </w:r>
+      <w:r>
+        <w:rPr>
+          <w:rStyle w:val="VerbatimChar"/>
+        </w:rPr>
+        <w:t xml:space="preserve">n''est</w:t>
+      </w:r>
+      <w:r>
+        <w:t xml:space="preserve">) sont voulues : c’est ainsi qu’on écrit une apostrophe dans une expression Power Automate.</w:t>
       </w:r>
     </w:p>
     <w:p>

</xml_diff>

<commit_message>
Schémas des 4 flux Power Automate (PDF, v3.8) ; déclencheur « créé ou modifié » avec condition
Co-Authored-By: Claude Opus 5.5 <noreply@anthropic.com>
Claude-Session: https://claude.ai/code/session_01FRdAzq8p3F9gJJe5MA3G79
</commit_message>
<xml_diff>
--- a/sharepoint-html-kit/appreciation/5-GUIDE-FLUX-DEPOT.docx
+++ b/sharepoint-html-kit/appreciation/5-GUIDE-FLUX-DEPOT.docx
@@ -208,6 +208,28 @@
           <w:iCs/>
           <w:i/>
         </w:rPr>
+        <w:t xml:space="preserve">. Le détail de chaque action, avec les flux 2, 3 et 4 de la phase 2, est dans</w:t>
+      </w:r>
+      <w:r>
+        <w:rPr>
+          <w:iCs/>
+          <w:i/>
+        </w:rPr>
+        <w:t xml:space="preserve"> </w:t>
+      </w:r>
+      <w:r>
+        <w:rPr>
+          <w:rStyle w:val="VerbatimChar"/>
+          <w:iCs/>
+          <w:i/>
+        </w:rPr>
+        <w:t xml:space="preserve">schemas/Schemas-flux-Power-Automate-v3.8.pdf</w:t>
+      </w:r>
+      <w:r>
+        <w:rPr>
+          <w:iCs/>
+          <w:i/>
+        </w:rPr>
         <w:t xml:space="preserve">.</w:t>
       </w:r>
     </w:p>
@@ -807,7 +829,7 @@
           <w:bCs/>
           <w:b/>
         </w:rPr>
-        <w:t xml:space="preserve">SharePoint — Lorsqu’un élément est créé</w:t>
+        <w:t xml:space="preserve">SharePoint — Lorsqu’un élément est créé ou modifié</w:t>
       </w:r>
       <w:r>
         <w:t xml:space="preserve">.</w:t>
@@ -876,7 +898,19 @@
         <w:t xml:space="preserve"> </w:t>
       </w:r>
       <w:r>
-        <w:t xml:space="preserve">: activez</w:t>
+        <w:t xml:space="preserve">:</w:t>
+      </w:r>
+    </w:p>
+    <w:p>
+      <w:pPr>
+        <w:numPr>
+          <w:ilvl w:val="1"/>
+          <w:numId w:val="1006"/>
+        </w:numPr>
+        <w:pStyle w:val="Compact"/>
+      </w:pPr>
+      <w:r>
+        <w:t xml:space="preserve">activez</w:t>
       </w:r>
       <w:r>
         <w:t xml:space="preserve"> </w:t>
@@ -902,7 +936,69 @@
         <w:t xml:space="preserve">degré de parallélisme de 1</w:t>
       </w:r>
       <w:r>
-        <w:t xml:space="preserve">. Les dépôts sont ainsi traités un à la fois.</w:t>
+        <w:t xml:space="preserve">, pour traiter les dépôts un à la fois ;</w:t>
+      </w:r>
+    </w:p>
+    <w:p>
+      <w:pPr>
+        <w:numPr>
+          <w:ilvl w:val="1"/>
+          <w:numId w:val="1006"/>
+        </w:numPr>
+        <w:pStyle w:val="Compact"/>
+      </w:pPr>
+      <w:r>
+        <w:t xml:space="preserve">dans</w:t>
+      </w:r>
+      <w:r>
+        <w:t xml:space="preserve"> </w:t>
+      </w:r>
+      <w:r>
+        <w:rPr>
+          <w:bCs/>
+          <w:b/>
+        </w:rPr>
+        <w:t xml:space="preserve">Conditions de déclenchement</w:t>
+      </w:r>
+      <w:r>
+        <w:t xml:space="preserve">, ajoutez :</w:t>
+      </w:r>
+      <w:r>
+        <w:t xml:space="preserve"> </w:t>
+      </w:r>
+      <w:r>
+        <w:rPr>
+          <w:rStyle w:val="VerbatimChar"/>
+        </w:rPr>
+        <w:t xml:space="preserve">@or(not(empty(triggerOutputs()?['body/Contenu'])), equals(triggerOutputs()?['body/Attachments'], true))</w:t>
+      </w:r>
+    </w:p>
+    <w:p>
+      <w:pPr>
+        <w:numPr>
+          <w:ilvl w:val="0"/>
+          <w:numId w:val="1000"/>
+        </w:numPr>
+        <w:pStyle w:val="BlockText"/>
+      </w:pPr>
+      <w:r>
+        <w:t xml:space="preserve">Pourquoi « créé</w:t>
+      </w:r>
+      <w:r>
+        <w:t xml:space="preserve"> </w:t>
+      </w:r>
+      <w:r>
+        <w:rPr>
+          <w:bCs/>
+          <w:b/>
+        </w:rPr>
+        <w:t xml:space="preserve">ou modifié</w:t>
+      </w:r>
+      <w:r>
+        <w:t xml:space="preserve"> </w:t>
+      </w:r>
+      <w:r>
+        <w:t xml:space="preserve">» ? Avec une pièce jointe, SharePoint crée d’abord l’élément, puis ajoute le fichier. La condition fait attendre le flux jusqu’à ce qu’il y ait un contenu collé ou une pièce jointe.</w:t>
       </w:r>
     </w:p>
     <w:bookmarkEnd w:id="25"/>
@@ -4382,59 +4478,21 @@
       <w:pPr>
         <w:numPr>
           <w:ilvl w:val="0"/>
-          <w:numId w:val="1006"/>
-        </w:numPr>
-        <w:pStyle w:val="Compact"/>
-      </w:pPr>
-      <w:r>
-        <w:t xml:space="preserve">Composer</w:t>
-      </w:r>
-      <w:r>
-        <w:t xml:space="preserve"> </w:t>
-      </w:r>
-      <w:r>
-        <w:rPr>
-          <w:rStyle w:val="VerbatimChar"/>
-        </w:rPr>
-        <w:t xml:space="preserve">Suivant</w:t>
-      </w:r>
-      <w:r>
-        <w:t xml:space="preserve"> </w:t>
-      </w:r>
-      <w:r>
-        <w:t xml:space="preserve">:</w:t>
-      </w:r>
-    </w:p>
-    <w:p>
-      <w:pPr>
-        <w:pStyle w:val="SourceCode"/>
-      </w:pPr>
-      <w:r>
-        <w:rPr>
-          <w:rStyle w:val="VerbatimChar"/>
-        </w:rPr>
-        <w:t xml:space="preserve">if(equals(outputs('Role'),'superieur_immediat'),'superieur_hierarchique', if(and(equals(outputs('Role'),'superieur_hierarchique'),equals(variables('dossier')?['options']?['directeurApplicable'],true)),'directeur',''))</w:t>
-      </w:r>
-    </w:p>
-    <w:p>
-      <w:pPr>
-        <w:numPr>
-          <w:ilvl w:val="0"/>
           <w:numId w:val="1007"/>
         </w:numPr>
         <w:pStyle w:val="Compact"/>
       </w:pPr>
       <w:r>
-        <w:t xml:space="preserve">Définir la variable</w:t>
-      </w:r>
-      <w:r>
-        <w:t xml:space="preserve"> </w:t>
-      </w:r>
-      <w:r>
-        <w:rPr>
-          <w:rStyle w:val="VerbatimChar"/>
-        </w:rPr>
-        <w:t xml:space="preserve">dossier</w:t>
+        <w:t xml:space="preserve">Composer</w:t>
+      </w:r>
+      <w:r>
+        <w:t xml:space="preserve"> </w:t>
+      </w:r>
+      <w:r>
+        <w:rPr>
+          <w:rStyle w:val="VerbatimChar"/>
+        </w:rPr>
+        <w:t xml:space="preserve">Suivant</w:t>
       </w:r>
       <w:r>
         <w:t xml:space="preserve"> </w:t>
@@ -4451,63 +4509,7 @@
         <w:rPr>
           <w:rStyle w:val="VerbatimChar"/>
         </w:rPr>
-        <w:t xml:space="preserve">if(empty(outputs('Suivant')), setProperty(outputs('AvecSignature'),'workflow',setProperty(outputs('AvecSignature')?['workflow'],'status','signature')), outputs('AvecSignature'))</w:t>
-      </w:r>
-    </w:p>
-    <w:p>
-      <w:pPr>
-        <w:pStyle w:val="FirstParagraph"/>
-      </w:pPr>
-      <w:r>
-        <w:t xml:space="preserve">Ensuite, une condition</w:t>
-      </w:r>
-      <w:r>
-        <w:t xml:space="preserve"> </w:t>
-      </w:r>
-      <w:r>
-        <w:rPr>
-          <w:rStyle w:val="VerbatimChar"/>
-        </w:rPr>
-        <w:t xml:space="preserve">empty(outputs('Suivant'))</w:t>
-      </w:r>
-      <w:r>
-        <w:t xml:space="preserve"> </w:t>
-      </w:r>
-      <w:r>
-        <w:t xml:space="preserve">:</w:t>
-      </w:r>
-      <w:r>
-        <w:t xml:space="preserve"> </w:t>
-      </w:r>
-      <w:r>
-        <w:t xml:space="preserve">-</w:t>
-      </w:r>
-      <w:r>
-        <w:t xml:space="preserve"> </w:t>
-      </w:r>
-      <w:r>
-        <w:rPr>
-          <w:bCs/>
-          <w:b/>
-        </w:rPr>
-        <w:t xml:space="preserve">Si non</w:t>
-      </w:r>
-      <w:r>
-        <w:t xml:space="preserve"> </w:t>
-      </w:r>
-      <w:r>
-        <w:t xml:space="preserve">: courriel « Approbation requise », envoyé à l’adresse suivante :</w:t>
-      </w:r>
-    </w:p>
-    <w:p>
-      <w:pPr>
-        <w:pStyle w:val="SourceCode"/>
-      </w:pPr>
-      <w:r>
-        <w:rPr>
-          <w:rStyle w:val="VerbatimChar"/>
-        </w:rPr>
-        <w:t xml:space="preserve">if(variables('modeTest'), variables('deposant'), coalesce(variables('dossier')?['workflow']?['participants']?[outputs('Suivant')]?['email'], variables('deposant')))</w:t>
+        <w:t xml:space="preserve">if(equals(outputs('Role'),'superieur_immediat'),'superieur_hierarchique', if(and(equals(outputs('Role'),'superieur_hierarchique'),equals(variables('dossier')?['options']?['directeurApplicable'],true)),'directeur',''))</w:t>
       </w:r>
     </w:p>
     <w:p>
@@ -4519,17 +4521,33 @@
         <w:pStyle w:val="Compact"/>
       </w:pPr>
       <w:r>
-        <w:rPr>
-          <w:bCs/>
-          <w:b/>
-        </w:rPr>
-        <w:t xml:space="preserve">Si oui</w:t>
-      </w:r>
-      <w:r>
-        <w:t xml:space="preserve"> </w:t>
-      </w:r>
-      <w:r>
-        <w:t xml:space="preserve">: courriel « Toutes les approbations sont obtenues », à la personne en appréciation et au supérieur immédiat.</w:t>
+        <w:t xml:space="preserve">Définir la variable</w:t>
+      </w:r>
+      <w:r>
+        <w:t xml:space="preserve"> </w:t>
+      </w:r>
+      <w:r>
+        <w:rPr>
+          <w:rStyle w:val="VerbatimChar"/>
+        </w:rPr>
+        <w:t xml:space="preserve">dossier</w:t>
+      </w:r>
+      <w:r>
+        <w:t xml:space="preserve"> </w:t>
+      </w:r>
+      <w:r>
+        <w:t xml:space="preserve">:</w:t>
+      </w:r>
+    </w:p>
+    <w:p>
+      <w:pPr>
+        <w:pStyle w:val="SourceCode"/>
+      </w:pPr>
+      <w:r>
+        <w:rPr>
+          <w:rStyle w:val="VerbatimChar"/>
+        </w:rPr>
+        <w:t xml:space="preserve">if(empty(outputs('Suivant')), setProperty(outputs('AvecSignature'),'workflow',setProperty(outputs('AvecSignature')?['workflow'],'status','signature')), outputs('AvecSignature'))</w:t>
       </w:r>
     </w:p>
     <w:p>
@@ -4537,66 +4555,16 @@
         <w:pStyle w:val="FirstParagraph"/>
       </w:pPr>
       <w:r>
-        <w:rPr>
-          <w:bCs/>
-          <w:b/>
-        </w:rPr>
-        <w:t xml:space="preserve">6.9 — Enregistrer, si aucun refus.</w:t>
-      </w:r>
-      <w:r>
-        <w:t xml:space="preserve"> </w:t>
-      </w:r>
-      <w:r>
-        <w:t xml:space="preserve">Condition</w:t>
-      </w:r>
-      <w:r>
-        <w:t xml:space="preserve"> </w:t>
-      </w:r>
-      <w:r>
-        <w:rPr>
-          <w:rStyle w:val="VerbatimChar"/>
-        </w:rPr>
-        <w:t xml:space="preserve">empty(variables('motifRefus'))</w:t>
-      </w:r>
-      <w:r>
-        <w:t xml:space="preserve">,</w:t>
-      </w:r>
-      <w:r>
-        <w:t xml:space="preserve"> </w:t>
-      </w:r>
-      <w:r>
-        <w:rPr>
-          <w:bCs/>
-          <w:b/>
-        </w:rPr>
-        <w:t xml:space="preserve">est égal à</w:t>
-      </w:r>
-      <w:r>
-        <w:t xml:space="preserve"> </w:t>
-      </w:r>
-      <w:r>
-        <w:rPr>
-          <w:rStyle w:val="VerbatimChar"/>
-        </w:rPr>
-        <w:t xml:space="preserve">true</w:t>
-      </w:r>
-      <w:r>
-        <w:t xml:space="preserve">. Dans la branche Oui :</w:t>
-      </w:r>
-      <w:r>
-        <w:t xml:space="preserve"> </w:t>
-      </w:r>
-      <w:r>
-        <w:t xml:space="preserve">1. Composer</w:t>
-      </w:r>
-      <w:r>
-        <w:t xml:space="preserve"> </w:t>
-      </w:r>
-      <w:r>
-        <w:rPr>
-          <w:rStyle w:val="VerbatimChar"/>
-        </w:rPr>
-        <w:t xml:space="preserve">Versionne</w:t>
+        <w:t xml:space="preserve">Ensuite, une condition</w:t>
+      </w:r>
+      <w:r>
+        <w:t xml:space="preserve"> </w:t>
+      </w:r>
+      <w:r>
+        <w:rPr>
+          <w:rStyle w:val="VerbatimChar"/>
+        </w:rPr>
+        <w:t xml:space="preserve">empty(outputs('Suivant'))</w:t>
       </w:r>
       <w:r>
         <w:t xml:space="preserve"> </w:t>
@@ -4604,6 +4572,28 @@
       <w:r>
         <w:t xml:space="preserve">:</w:t>
       </w:r>
+      <w:r>
+        <w:t xml:space="preserve"> </w:t>
+      </w:r>
+      <w:r>
+        <w:t xml:space="preserve">-</w:t>
+      </w:r>
+      <w:r>
+        <w:t xml:space="preserve"> </w:t>
+      </w:r>
+      <w:r>
+        <w:rPr>
+          <w:bCs/>
+          <w:b/>
+        </w:rPr>
+        <w:t xml:space="preserve">Si non</w:t>
+      </w:r>
+      <w:r>
+        <w:t xml:space="preserve"> </w:t>
+      </w:r>
+      <w:r>
+        <w:t xml:space="preserve">: courriel « Approbation requise », envoyé à l’adresse suivante :</w:t>
+      </w:r>
     </w:p>
     <w:p>
       <w:pPr>
@@ -4613,7 +4603,7 @@
         <w:rPr>
           <w:rStyle w:val="VerbatimChar"/>
         </w:rPr>
-        <w:t xml:space="preserve">setProperty(variables('dossier'),'workflow',setProperty(setProperty(variables('dossier')?['workflow'],'version',add(coalesce(variables('dossier')?['workflow']?['version'],0),1)),'derniereMaj',variables('maintenant')))</w:t>
+        <w:t xml:space="preserve">if(variables('modeTest'), variables('deposant'), coalesce(variables('dossier')?['workflow']?['participants']?[outputs('Suivant')]?['email'], variables('deposant')))</w:t>
       </w:r>
     </w:p>
     <w:p>
@@ -4625,109 +4615,215 @@
         <w:pStyle w:val="Compact"/>
       </w:pPr>
       <w:r>
-        <w:t xml:space="preserve">Action SharePoint</w:t>
-      </w:r>
-      <w:r>
-        <w:t xml:space="preserve"> </w:t>
-      </w:r>
-      <w:r>
-        <w:rPr>
-          <w:bCs/>
-          <w:b/>
-        </w:rPr>
-        <w:t xml:space="preserve">Mettre à jour le fichier</w:t>
-      </w:r>
-      <w:r>
-        <w:t xml:space="preserve">. Identificateur :</w:t>
-      </w:r>
-      <w:r>
-        <w:t xml:space="preserve"> </w:t>
-      </w:r>
-      <w:r>
-        <w:rPr>
-          <w:rStyle w:val="VerbatimChar"/>
-        </w:rPr>
-        <w:t xml:space="preserve">first(body('ChercherDossier')?['value'])?['{Identifier}']</w:t>
-      </w:r>
-      <w:r>
-        <w:t xml:space="preserve">. Contenu :</w:t>
-      </w:r>
-      <w:r>
-        <w:t xml:space="preserve"> </w:t>
-      </w:r>
-      <w:r>
-        <w:rPr>
-          <w:rStyle w:val="VerbatimChar"/>
-        </w:rPr>
-        <w:t xml:space="preserve">string(outputs('Versionne'))</w:t>
-      </w:r>
-      <w:r>
-        <w:t xml:space="preserve">.</w:t>
+        <w:rPr>
+          <w:bCs/>
+          <w:b/>
+        </w:rPr>
+        <w:t xml:space="preserve">Si oui</w:t>
+      </w:r>
+      <w:r>
+        <w:t xml:space="preserve"> </w:t>
+      </w:r>
+      <w:r>
+        <w:t xml:space="preserve">: courriel « Toutes les approbations sont obtenues », à la personne en appréciation et au supérieur immédiat.</w:t>
+      </w:r>
+    </w:p>
+    <w:p>
+      <w:pPr>
+        <w:pStyle w:val="FirstParagraph"/>
+      </w:pPr>
+      <w:r>
+        <w:rPr>
+          <w:bCs/>
+          <w:b/>
+        </w:rPr>
+        <w:t xml:space="preserve">6.9 — Enregistrer, si aucun refus.</w:t>
+      </w:r>
+      <w:r>
+        <w:t xml:space="preserve"> </w:t>
+      </w:r>
+      <w:r>
+        <w:t xml:space="preserve">Condition</w:t>
+      </w:r>
+      <w:r>
+        <w:t xml:space="preserve"> </w:t>
+      </w:r>
+      <w:r>
+        <w:rPr>
+          <w:rStyle w:val="VerbatimChar"/>
+        </w:rPr>
+        <w:t xml:space="preserve">empty(variables('motifRefus'))</w:t>
+      </w:r>
+      <w:r>
+        <w:t xml:space="preserve">,</w:t>
+      </w:r>
+      <w:r>
+        <w:t xml:space="preserve"> </w:t>
+      </w:r>
+      <w:r>
+        <w:rPr>
+          <w:bCs/>
+          <w:b/>
+        </w:rPr>
+        <w:t xml:space="preserve">est égal à</w:t>
+      </w:r>
+      <w:r>
+        <w:t xml:space="preserve"> </w:t>
+      </w:r>
+      <w:r>
+        <w:rPr>
+          <w:rStyle w:val="VerbatimChar"/>
+        </w:rPr>
+        <w:t xml:space="preserve">true</w:t>
+      </w:r>
+      <w:r>
+        <w:t xml:space="preserve">. Dans la branche Oui :</w:t>
+      </w:r>
+      <w:r>
+        <w:t xml:space="preserve"> </w:t>
+      </w:r>
+      <w:r>
+        <w:t xml:space="preserve">1. Composer</w:t>
+      </w:r>
+      <w:r>
+        <w:t xml:space="preserve"> </w:t>
+      </w:r>
+      <w:r>
+        <w:rPr>
+          <w:rStyle w:val="VerbatimChar"/>
+        </w:rPr>
+        <w:t xml:space="preserve">Versionne</w:t>
+      </w:r>
+      <w:r>
+        <w:t xml:space="preserve"> </w:t>
+      </w:r>
+      <w:r>
+        <w:t xml:space="preserve">:</w:t>
+      </w:r>
+    </w:p>
+    <w:p>
+      <w:pPr>
+        <w:pStyle w:val="SourceCode"/>
+      </w:pPr>
+      <w:r>
+        <w:rPr>
+          <w:rStyle w:val="VerbatimChar"/>
+        </w:rPr>
+        <w:t xml:space="preserve">setProperty(variables('dossier'),'workflow',setProperty(setProperty(variables('dossier')?['workflow'],'version',add(coalesce(variables('dossier')?['workflow']?['version'],0),1)),'derniereMaj',variables('maintenant')))</w:t>
       </w:r>
     </w:p>
     <w:p>
       <w:pPr>
         <w:numPr>
           <w:ilvl w:val="0"/>
-          <w:numId w:val="1009"/>
-        </w:numPr>
-        <w:pStyle w:val="Compact"/>
-      </w:pPr>
-      <w:r>
-        <w:t xml:space="preserve">Action</w:t>
-      </w:r>
-      <w:r>
-        <w:t xml:space="preserve"> </w:t>
-      </w:r>
-      <w:r>
-        <w:rPr>
-          <w:bCs/>
-          <w:b/>
-        </w:rPr>
-        <w:t xml:space="preserve">Mettre à jour les propriétés du fichier</w:t>
-      </w:r>
-      <w:r>
-        <w:t xml:space="preserve">. Id :</w:t>
-      </w:r>
-      <w:r>
-        <w:t xml:space="preserve"> </w:t>
-      </w:r>
-      <w:r>
-        <w:rPr>
-          <w:rStyle w:val="VerbatimChar"/>
-        </w:rPr>
-        <w:t xml:space="preserve">first(body('ChercherDossier')?['value'])?['ID']</w:t>
-      </w:r>
-      <w:r>
-        <w:t xml:space="preserve">.</w:t>
-      </w:r>
-    </w:p>
-    <w:p>
-      <w:pPr>
-        <w:numPr>
-          <w:ilvl w:val="1"/>
           <w:numId w:val="1010"/>
         </w:numPr>
         <w:pStyle w:val="Compact"/>
       </w:pPr>
       <w:r>
-        <w:t xml:space="preserve">NomPersonne :</w:t>
-      </w:r>
-      <w:r>
-        <w:t xml:space="preserve"> </w:t>
-      </w:r>
-      <w:r>
-        <w:rPr>
-          <w:rStyle w:val="VerbatimChar"/>
-        </w:rPr>
-        <w:t xml:space="preserve">outputs('Versionne')?['identification']?['nom']</w:t>
+        <w:t xml:space="preserve">Action SharePoint</w:t>
+      </w:r>
+      <w:r>
+        <w:t xml:space="preserve"> </w:t>
+      </w:r>
+      <w:r>
+        <w:rPr>
+          <w:bCs/>
+          <w:b/>
+        </w:rPr>
+        <w:t xml:space="preserve">Mettre à jour le fichier</w:t>
+      </w:r>
+      <w:r>
+        <w:t xml:space="preserve">. Identificateur :</w:t>
+      </w:r>
+      <w:r>
+        <w:t xml:space="preserve"> </w:t>
+      </w:r>
+      <w:r>
+        <w:rPr>
+          <w:rStyle w:val="VerbatimChar"/>
+        </w:rPr>
+        <w:t xml:space="preserve">first(body('ChercherDossier')?['value'])?['{Identifier}']</w:t>
+      </w:r>
+      <w:r>
+        <w:t xml:space="preserve">. Contenu :</w:t>
+      </w:r>
+      <w:r>
+        <w:t xml:space="preserve"> </w:t>
+      </w:r>
+      <w:r>
+        <w:rPr>
+          <w:rStyle w:val="VerbatimChar"/>
+        </w:rPr>
+        <w:t xml:space="preserve">string(outputs('Versionne'))</w:t>
+      </w:r>
+      <w:r>
+        <w:t xml:space="preserve">.</w:t>
+      </w:r>
+    </w:p>
+    <w:p>
+      <w:pPr>
+        <w:numPr>
+          <w:ilvl w:val="0"/>
+          <w:numId w:val="1010"/>
+        </w:numPr>
+        <w:pStyle w:val="Compact"/>
+      </w:pPr>
+      <w:r>
+        <w:t xml:space="preserve">Action</w:t>
+      </w:r>
+      <w:r>
+        <w:t xml:space="preserve"> </w:t>
+      </w:r>
+      <w:r>
+        <w:rPr>
+          <w:bCs/>
+          <w:b/>
+        </w:rPr>
+        <w:t xml:space="preserve">Mettre à jour les propriétés du fichier</w:t>
+      </w:r>
+      <w:r>
+        <w:t xml:space="preserve">. Id :</w:t>
+      </w:r>
+      <w:r>
+        <w:t xml:space="preserve"> </w:t>
+      </w:r>
+      <w:r>
+        <w:rPr>
+          <w:rStyle w:val="VerbatimChar"/>
+        </w:rPr>
+        <w:t xml:space="preserve">first(body('ChercherDossier')?['value'])?['ID']</w:t>
+      </w:r>
+      <w:r>
+        <w:t xml:space="preserve">.</w:t>
       </w:r>
     </w:p>
     <w:p>
       <w:pPr>
         <w:numPr>
           <w:ilvl w:val="1"/>
-          <w:numId w:val="1010"/>
+          <w:numId w:val="1011"/>
+        </w:numPr>
+        <w:pStyle w:val="Compact"/>
+      </w:pPr>
+      <w:r>
+        <w:t xml:space="preserve">NomPersonne :</w:t>
+      </w:r>
+      <w:r>
+        <w:t xml:space="preserve"> </w:t>
+      </w:r>
+      <w:r>
+        <w:rPr>
+          <w:rStyle w:val="VerbatimChar"/>
+        </w:rPr>
+        <w:t xml:space="preserve">outputs('Versionne')?['identification']?['nom']</w:t>
+      </w:r>
+    </w:p>
+    <w:p>
+      <w:pPr>
+        <w:numPr>
+          <w:ilvl w:val="1"/>
+          <w:numId w:val="1011"/>
         </w:numPr>
         <w:pStyle w:val="Compact"/>
       </w:pPr>
@@ -4754,341 +4850,94 @@
       <w:pPr>
         <w:numPr>
           <w:ilvl w:val="1"/>
-          <w:numId w:val="1011"/>
-        </w:numPr>
-        <w:pStyle w:val="Compact"/>
-      </w:pPr>
-      <w:r>
-        <w:t xml:space="preserve">EtapeEnCours :</w:t>
-      </w:r>
-      <w:r>
-        <w:t xml:space="preserve"> </w:t>
-      </w:r>
-      <w:r>
-        <w:rPr>
-          <w:rStyle w:val="VerbatimChar"/>
-        </w:rPr>
-        <w:t xml:space="preserve">outputs('Versionne')?['workflow']?['status']</w:t>
-      </w:r>
-    </w:p>
-    <w:p>
-      <w:pPr>
-        <w:numPr>
-          <w:ilvl w:val="1"/>
-          <w:numId w:val="1011"/>
-        </w:numPr>
-        <w:pStyle w:val="Compact"/>
-      </w:pPr>
-      <w:r>
-        <w:t xml:space="preserve">DerniereMaj :</w:t>
-      </w:r>
-      <w:r>
-        <w:t xml:space="preserve"> </w:t>
-      </w:r>
-      <w:r>
-        <w:rPr>
-          <w:rStyle w:val="VerbatimChar"/>
-        </w:rPr>
-        <w:t xml:space="preserve">utcNow()</w:t>
-      </w:r>
-    </w:p>
-    <w:bookmarkEnd w:id="29"/>
-    <w:bookmarkStart w:id="30" w:name="après-létendue-répondre-et-nettoyer"/>
-    <w:p>
-      <w:pPr>
-        <w:pStyle w:val="Heading2"/>
-      </w:pPr>
-      <w:r>
-        <w:t xml:space="preserve">7. Après l’étendue : répondre et nettoyer</w:t>
-      </w:r>
-    </w:p>
-    <w:p>
-      <w:pPr>
-        <w:pStyle w:val="FirstParagraph"/>
-      </w:pPr>
-      <w:r>
-        <w:t xml:space="preserve">Ces actions vont</w:t>
-      </w:r>
-      <w:r>
-        <w:t xml:space="preserve"> </w:t>
-      </w:r>
-      <w:r>
-        <w:rPr>
-          <w:bCs/>
-          <w:b/>
-        </w:rPr>
-        <w:t xml:space="preserve">après</w:t>
-      </w:r>
-      <w:r>
-        <w:t xml:space="preserve"> </w:t>
-      </w:r>
-      <w:r>
-        <w:t xml:space="preserve">l’étendue</w:t>
-      </w:r>
-      <w:r>
-        <w:t xml:space="preserve"> </w:t>
-      </w:r>
-      <w:r>
-        <w:rPr>
-          <w:rStyle w:val="VerbatimChar"/>
-        </w:rPr>
-        <w:t xml:space="preserve">Traitement</w:t>
-      </w:r>
-      <w:r>
-        <w:t xml:space="preserve">, pas dedans.</w:t>
-      </w:r>
-    </w:p>
-    <w:p>
-      <w:pPr>
-        <w:numPr>
-          <w:ilvl w:val="0"/>
           <w:numId w:val="1012"/>
         </w:numPr>
         <w:pStyle w:val="Compact"/>
       </w:pPr>
       <w:r>
-        <w:rPr>
-          <w:bCs/>
-          <w:b/>
-        </w:rPr>
-        <w:t xml:space="preserve">Étendue</w:t>
-      </w:r>
-      <w:r>
-        <w:rPr>
-          <w:bCs/>
-          <w:b/>
-        </w:rPr>
-        <w:t xml:space="preserve"> </w:t>
-      </w:r>
-      <w:r>
-        <w:rPr>
-          <w:rStyle w:val="VerbatimChar"/>
-          <w:bCs/>
-          <w:b/>
-        </w:rPr>
-        <w:t xml:space="preserve">EnCasErreur</w:t>
-      </w:r>
-      <w:r>
-        <w:rPr>
-          <w:bCs/>
-          <w:b/>
-        </w:rPr>
-        <w:t xml:space="preserve">.</w:t>
-      </w:r>
-      <w:r>
-        <w:t xml:space="preserve"> </w:t>
-      </w:r>
-      <w:r>
-        <w:t xml:space="preserve">Dans</w:t>
-      </w:r>
-      <w:r>
-        <w:t xml:space="preserve"> </w:t>
-      </w:r>
-      <w:r>
-        <w:rPr>
-          <w:bCs/>
-          <w:b/>
-        </w:rPr>
-        <w:t xml:space="preserve">… › Configurer l’exécution après</w:t>
-      </w:r>
-      <w:r>
-        <w:t xml:space="preserve">, cochez</w:t>
-      </w:r>
-      <w:r>
-        <w:t xml:space="preserve"> </w:t>
-      </w:r>
-      <w:r>
-        <w:rPr>
-          <w:bCs/>
-          <w:b/>
-        </w:rPr>
-        <w:t xml:space="preserve">a échoué</w:t>
-      </w:r>
-      <w:r>
-        <w:t xml:space="preserve"> </w:t>
-      </w:r>
-      <w:r>
-        <w:t xml:space="preserve">et</w:t>
-      </w:r>
-      <w:r>
-        <w:t xml:space="preserve"> </w:t>
-      </w:r>
-      <w:r>
-        <w:rPr>
-          <w:bCs/>
-          <w:b/>
-        </w:rPr>
-        <w:t xml:space="preserve">a expiré</w:t>
-      </w:r>
-      <w:r>
-        <w:t xml:space="preserve">, et décochez</w:t>
-      </w:r>
-      <w:r>
-        <w:t xml:space="preserve"> </w:t>
-      </w:r>
-      <w:r>
-        <w:rPr>
-          <w:bCs/>
-          <w:b/>
-        </w:rPr>
-        <w:t xml:space="preserve">a réussi</w:t>
-      </w:r>
-      <w:r>
-        <w:t xml:space="preserve">. Dedans :</w:t>
-      </w:r>
-      <w:r>
-        <w:t xml:space="preserve"> </w:t>
-      </w:r>
-      <w:r>
-        <w:rPr>
-          <w:bCs/>
-          <w:b/>
-        </w:rPr>
-        <w:t xml:space="preserve">Définir une variable</w:t>
-      </w:r>
-      <w:r>
-        <w:t xml:space="preserve"> </w:t>
-      </w:r>
-      <w:r>
-        <w:rPr>
-          <w:rStyle w:val="VerbatimChar"/>
-        </w:rPr>
-        <w:t xml:space="preserve">motifRefus</w:t>
-      </w:r>
-      <w:r>
-        <w:t xml:space="preserve"> </w:t>
-      </w:r>
-      <w:r>
-        <w:t xml:space="preserve">=</w:t>
-      </w:r>
-      <w:r>
-        <w:t xml:space="preserve"> </w:t>
-      </w:r>
-      <w:r>
-        <w:rPr>
-          <w:rStyle w:val="VerbatimChar"/>
-        </w:rPr>
-        <w:t xml:space="preserve">Le dépôt n'a pas pu être lu. Recommencez avec le bouton « Copier le contenu du dépôt ».</w:t>
+        <w:t xml:space="preserve">EtapeEnCours :</w:t>
+      </w:r>
+      <w:r>
+        <w:t xml:space="preserve"> </w:t>
+      </w:r>
+      <w:r>
+        <w:rPr>
+          <w:rStyle w:val="VerbatimChar"/>
+        </w:rPr>
+        <w:t xml:space="preserve">outputs('Versionne')?['workflow']?['status']</w:t>
       </w:r>
     </w:p>
     <w:p>
       <w:pPr>
         <w:numPr>
-          <w:ilvl w:val="0"/>
+          <w:ilvl w:val="1"/>
           <w:numId w:val="1012"/>
         </w:numPr>
         <w:pStyle w:val="Compact"/>
       </w:pPr>
       <w:r>
-        <w:rPr>
-          <w:bCs/>
-          <w:b/>
-        </w:rPr>
-        <w:t xml:space="preserve">Condition</w:t>
-      </w:r>
-      <w:r>
-        <w:rPr>
-          <w:bCs/>
-          <w:b/>
-        </w:rPr>
-        <w:t xml:space="preserve"> </w:t>
-      </w:r>
-      <w:r>
-        <w:rPr>
-          <w:rStyle w:val="VerbatimChar"/>
-          <w:bCs/>
-          <w:b/>
-        </w:rPr>
-        <w:t xml:space="preserve">Accepte</w:t>
-      </w:r>
-      <w:r>
-        <w:rPr>
-          <w:bCs/>
-          <w:b/>
-        </w:rPr>
-        <w:t xml:space="preserve">.</w:t>
-      </w:r>
-      <w:r>
-        <w:t xml:space="preserve"> </w:t>
-      </w:r>
-      <w:r>
-        <w:rPr>
-          <w:rStyle w:val="VerbatimChar"/>
-        </w:rPr>
-        <w:t xml:space="preserve">empty(variables('motifRefus'))</w:t>
-      </w:r>
-      <w:r>
-        <w:t xml:space="preserve">,</w:t>
-      </w:r>
-      <w:r>
-        <w:t xml:space="preserve"> </w:t>
-      </w:r>
-      <w:r>
-        <w:rPr>
-          <w:bCs/>
-          <w:b/>
-        </w:rPr>
-        <w:t xml:space="preserve">est égal à</w:t>
-      </w:r>
-      <w:r>
-        <w:t xml:space="preserve"> </w:t>
-      </w:r>
-      <w:r>
-        <w:rPr>
-          <w:rStyle w:val="VerbatimChar"/>
-        </w:rPr>
-        <w:t xml:space="preserve">true</w:t>
-      </w:r>
-      <w:r>
-        <w:t xml:space="preserve">. Dans</w:t>
-      </w:r>
-      <w:r>
-        <w:t xml:space="preserve"> </w:t>
-      </w:r>
-      <w:r>
-        <w:rPr>
-          <w:bCs/>
-          <w:b/>
-        </w:rPr>
-        <w:t xml:space="preserve">Configurer l’exécution après</w:t>
-      </w:r>
-      <w:r>
-        <w:t xml:space="preserve">, cochez</w:t>
-      </w:r>
-      <w:r>
-        <w:t xml:space="preserve"> </w:t>
-      </w:r>
-      <w:r>
-        <w:rPr>
-          <w:bCs/>
-          <w:b/>
-        </w:rPr>
-        <w:t xml:space="preserve">a réussi</w:t>
-      </w:r>
-      <w:r>
-        <w:t xml:space="preserve"> </w:t>
-      </w:r>
-      <w:r>
-        <w:t xml:space="preserve">et</w:t>
-      </w:r>
-      <w:r>
-        <w:t xml:space="preserve"> </w:t>
-      </w:r>
-      <w:r>
-        <w:rPr>
-          <w:bCs/>
-          <w:b/>
-        </w:rPr>
-        <w:t xml:space="preserve">a été ignoré</w:t>
-      </w:r>
-      <w:r>
-        <w:t xml:space="preserve">.</w:t>
+        <w:t xml:space="preserve">DerniereMaj :</w:t>
+      </w:r>
+      <w:r>
+        <w:t xml:space="preserve"> </w:t>
+      </w:r>
+      <w:r>
+        <w:rPr>
+          <w:rStyle w:val="VerbatimChar"/>
+        </w:rPr>
+        <w:t xml:space="preserve">utcNow()</w:t>
+      </w:r>
+    </w:p>
+    <w:bookmarkEnd w:id="29"/>
+    <w:bookmarkStart w:id="30" w:name="après-létendue-répondre-et-nettoyer"/>
+    <w:p>
+      <w:pPr>
+        <w:pStyle w:val="Heading2"/>
+      </w:pPr>
+      <w:r>
+        <w:t xml:space="preserve">7. Après l’étendue : répondre et nettoyer</w:t>
+      </w:r>
+    </w:p>
+    <w:p>
+      <w:pPr>
+        <w:pStyle w:val="FirstParagraph"/>
+      </w:pPr>
+      <w:r>
+        <w:t xml:space="preserve">Ces actions vont</w:t>
+      </w:r>
+      <w:r>
+        <w:t xml:space="preserve"> </w:t>
+      </w:r>
+      <w:r>
+        <w:rPr>
+          <w:bCs/>
+          <w:b/>
+        </w:rPr>
+        <w:t xml:space="preserve">après</w:t>
+      </w:r>
+      <w:r>
+        <w:t xml:space="preserve"> </w:t>
+      </w:r>
+      <w:r>
+        <w:t xml:space="preserve">l’étendue</w:t>
+      </w:r>
+      <w:r>
+        <w:t xml:space="preserve"> </w:t>
+      </w:r>
+      <w:r>
+        <w:rPr>
+          <w:rStyle w:val="VerbatimChar"/>
+        </w:rPr>
+        <w:t xml:space="preserve">Traitement</w:t>
+      </w:r>
+      <w:r>
+        <w:t xml:space="preserve">, pas dedans.</w:t>
       </w:r>
     </w:p>
     <w:p>
       <w:pPr>
         <w:numPr>
-          <w:ilvl w:val="1"/>
+          <w:ilvl w:val="0"/>
           <w:numId w:val="1013"/>
         </w:numPr>
         <w:pStyle w:val="Compact"/>
@@ -5098,19 +4947,130 @@
           <w:bCs/>
           <w:b/>
         </w:rPr>
-        <w:t xml:space="preserve">Si oui</w:t>
-      </w:r>
-      <w:r>
-        <w:t xml:space="preserve"> </w:t>
-      </w:r>
-      <w:r>
-        <w:t xml:space="preserve">: courriel « Dépôt accepté » au déposant.</w:t>
+        <w:t xml:space="preserve">Étendue</w:t>
+      </w:r>
+      <w:r>
+        <w:rPr>
+          <w:bCs/>
+          <w:b/>
+        </w:rPr>
+        <w:t xml:space="preserve"> </w:t>
+      </w:r>
+      <w:r>
+        <w:rPr>
+          <w:rStyle w:val="VerbatimChar"/>
+          <w:bCs/>
+          <w:b/>
+        </w:rPr>
+        <w:t xml:space="preserve">EnCasErreur</w:t>
+      </w:r>
+      <w:r>
+        <w:rPr>
+          <w:bCs/>
+          <w:b/>
+        </w:rPr>
+        <w:t xml:space="preserve">.</w:t>
+      </w:r>
+      <w:r>
+        <w:t xml:space="preserve"> </w:t>
+      </w:r>
+      <w:r>
+        <w:t xml:space="preserve">Dans</w:t>
+      </w:r>
+      <w:r>
+        <w:t xml:space="preserve"> </w:t>
+      </w:r>
+      <w:r>
+        <w:rPr>
+          <w:bCs/>
+          <w:b/>
+        </w:rPr>
+        <w:t xml:space="preserve">… › Configurer l’exécution après</w:t>
+      </w:r>
+      <w:r>
+        <w:t xml:space="preserve">, cochez</w:t>
+      </w:r>
+      <w:r>
+        <w:t xml:space="preserve"> </w:t>
+      </w:r>
+      <w:r>
+        <w:rPr>
+          <w:bCs/>
+          <w:b/>
+        </w:rPr>
+        <w:t xml:space="preserve">a échoué</w:t>
+      </w:r>
+      <w:r>
+        <w:t xml:space="preserve"> </w:t>
+      </w:r>
+      <w:r>
+        <w:t xml:space="preserve">et</w:t>
+      </w:r>
+      <w:r>
+        <w:t xml:space="preserve"> </w:t>
+      </w:r>
+      <w:r>
+        <w:rPr>
+          <w:bCs/>
+          <w:b/>
+        </w:rPr>
+        <w:t xml:space="preserve">a expiré</w:t>
+      </w:r>
+      <w:r>
+        <w:t xml:space="preserve">, et décochez</w:t>
+      </w:r>
+      <w:r>
+        <w:t xml:space="preserve"> </w:t>
+      </w:r>
+      <w:r>
+        <w:rPr>
+          <w:bCs/>
+          <w:b/>
+        </w:rPr>
+        <w:t xml:space="preserve">a réussi</w:t>
+      </w:r>
+      <w:r>
+        <w:t xml:space="preserve">. Dedans :</w:t>
+      </w:r>
+      <w:r>
+        <w:t xml:space="preserve"> </w:t>
+      </w:r>
+      <w:r>
+        <w:rPr>
+          <w:bCs/>
+          <w:b/>
+        </w:rPr>
+        <w:t xml:space="preserve">Définir une variable</w:t>
+      </w:r>
+      <w:r>
+        <w:t xml:space="preserve"> </w:t>
+      </w:r>
+      <w:r>
+        <w:rPr>
+          <w:rStyle w:val="VerbatimChar"/>
+        </w:rPr>
+        <w:t xml:space="preserve">motifRefus</w:t>
+      </w:r>
+      <w:r>
+        <w:t xml:space="preserve"> </w:t>
+      </w:r>
+      <w:r>
+        <w:t xml:space="preserve">=</w:t>
+      </w:r>
+      <w:r>
+        <w:t xml:space="preserve"> </w:t>
+      </w:r>
+      <w:r>
+        <w:rPr>
+          <w:rStyle w:val="VerbatimChar"/>
+        </w:rPr>
+        <w:t xml:space="preserve">Le dépôt n'a pas pu être lu. Recommencez avec le bouton « Copier le contenu du dépôt ».</w:t>
       </w:r>
     </w:p>
     <w:p>
       <w:pPr>
         <w:numPr>
-          <w:ilvl w:val="1"/>
+          <w:ilvl w:val="0"/>
           <w:numId w:val="1013"/>
         </w:numPr>
         <w:pStyle w:val="Compact"/>
@@ -5120,133 +5080,111 @@
           <w:bCs/>
           <w:b/>
         </w:rPr>
-        <w:t xml:space="preserve">Si non</w:t>
-      </w:r>
-      <w:r>
-        <w:t xml:space="preserve"> </w:t>
-      </w:r>
-      <w:r>
-        <w:t xml:space="preserve">: courriel « Dépôt refusé » au déposant.</w:t>
+        <w:t xml:space="preserve">Condition</w:t>
+      </w:r>
+      <w:r>
+        <w:rPr>
+          <w:bCs/>
+          <w:b/>
+        </w:rPr>
+        <w:t xml:space="preserve"> </w:t>
+      </w:r>
+      <w:r>
+        <w:rPr>
+          <w:rStyle w:val="VerbatimChar"/>
+          <w:bCs/>
+          <w:b/>
+        </w:rPr>
+        <w:t xml:space="preserve">Accepte</w:t>
+      </w:r>
+      <w:r>
+        <w:rPr>
+          <w:bCs/>
+          <w:b/>
+        </w:rPr>
+        <w:t xml:space="preserve">.</w:t>
+      </w:r>
+      <w:r>
+        <w:t xml:space="preserve"> </w:t>
+      </w:r>
+      <w:r>
+        <w:rPr>
+          <w:rStyle w:val="VerbatimChar"/>
+        </w:rPr>
+        <w:t xml:space="preserve">empty(variables('motifRefus'))</w:t>
+      </w:r>
+      <w:r>
+        <w:t xml:space="preserve">,</w:t>
+      </w:r>
+      <w:r>
+        <w:t xml:space="preserve"> </w:t>
+      </w:r>
+      <w:r>
+        <w:rPr>
+          <w:bCs/>
+          <w:b/>
+        </w:rPr>
+        <w:t xml:space="preserve">est égal à</w:t>
+      </w:r>
+      <w:r>
+        <w:t xml:space="preserve"> </w:t>
+      </w:r>
+      <w:r>
+        <w:rPr>
+          <w:rStyle w:val="VerbatimChar"/>
+        </w:rPr>
+        <w:t xml:space="preserve">true</w:t>
+      </w:r>
+      <w:r>
+        <w:t xml:space="preserve">. Dans</w:t>
+      </w:r>
+      <w:r>
+        <w:t xml:space="preserve"> </w:t>
+      </w:r>
+      <w:r>
+        <w:rPr>
+          <w:bCs/>
+          <w:b/>
+        </w:rPr>
+        <w:t xml:space="preserve">Configurer l’exécution après</w:t>
+      </w:r>
+      <w:r>
+        <w:t xml:space="preserve">, cochez</w:t>
+      </w:r>
+      <w:r>
+        <w:t xml:space="preserve"> </w:t>
+      </w:r>
+      <w:r>
+        <w:rPr>
+          <w:bCs/>
+          <w:b/>
+        </w:rPr>
+        <w:t xml:space="preserve">a réussi</w:t>
+      </w:r>
+      <w:r>
+        <w:t xml:space="preserve"> </w:t>
+      </w:r>
+      <w:r>
+        <w:t xml:space="preserve">et</w:t>
+      </w:r>
+      <w:r>
+        <w:t xml:space="preserve"> </w:t>
+      </w:r>
+      <w:r>
+        <w:rPr>
+          <w:bCs/>
+          <w:b/>
+        </w:rPr>
+        <w:t xml:space="preserve">a été ignoré</w:t>
+      </w:r>
+      <w:r>
+        <w:t xml:space="preserve">.</w:t>
       </w:r>
     </w:p>
     <w:p>
       <w:pPr>
         <w:numPr>
-          <w:ilvl w:val="0"/>
-          <w:numId w:val="1012"/>
-        </w:numPr>
-        <w:pStyle w:val="Compact"/>
-      </w:pPr>
-      <w:r>
-        <w:rPr>
-          <w:bCs/>
-          <w:b/>
-        </w:rPr>
-        <w:t xml:space="preserve">Supprimer l’élément de dépôt.</w:t>
-      </w:r>
-      <w:r>
-        <w:t xml:space="preserve"> </w:t>
-      </w:r>
-      <w:r>
-        <w:t xml:space="preserve">Action SharePoint</w:t>
-      </w:r>
-      <w:r>
-        <w:t xml:space="preserve"> </w:t>
-      </w:r>
-      <w:r>
-        <w:rPr>
-          <w:bCs/>
-          <w:b/>
-        </w:rPr>
-        <w:t xml:space="preserve">Supprimer l’élément</w:t>
-      </w:r>
-      <w:r>
-        <w:t xml:space="preserve">, liste Depot_Appreciations, Id =</w:t>
-      </w:r>
-      <w:r>
-        <w:t xml:space="preserve"> </w:t>
-      </w:r>
-      <w:r>
-        <w:rPr>
-          <w:bCs/>
-          <w:b/>
-        </w:rPr>
-        <w:t xml:space="preserve">ID</w:t>
-      </w:r>
-      <w:r>
-        <w:t xml:space="preserve"> </w:t>
-      </w:r>
-      <w:r>
-        <w:t xml:space="preserve">du déclencheur. Dans</w:t>
-      </w:r>
-      <w:r>
-        <w:t xml:space="preserve"> </w:t>
-      </w:r>
-      <w:r>
-        <w:rPr>
-          <w:bCs/>
-          <w:b/>
-        </w:rPr>
-        <w:t xml:space="preserve">Configurer l’exécution après</w:t>
-      </w:r>
-      <w:r>
-        <w:t xml:space="preserve">, cochez</w:t>
-      </w:r>
-      <w:r>
-        <w:t xml:space="preserve"> </w:t>
-      </w:r>
-      <w:r>
-        <w:rPr>
-          <w:bCs/>
-          <w:b/>
-        </w:rPr>
-        <w:t xml:space="preserve">toutes</w:t>
-      </w:r>
-      <w:r>
-        <w:t xml:space="preserve"> </w:t>
-      </w:r>
-      <w:r>
-        <w:t xml:space="preserve">les cases.</w:t>
-      </w:r>
-    </w:p>
-    <w:bookmarkEnd w:id="30"/>
-    <w:bookmarkStart w:id="31" w:name="Xf00ff7754150d667c16f762d88d2a763dc1d03c"/>
-    <w:p>
-      <w:pPr>
-        <w:pStyle w:val="Heading2"/>
-      </w:pPr>
-      <w:r>
-        <w:t xml:space="preserve">8. Les courriels (Office 365 Outlook — Envoyer un courriel (V2))</w:t>
-      </w:r>
-    </w:p>
-    <w:p>
-      <w:pPr>
-        <w:pStyle w:val="FirstParagraph"/>
-      </w:pPr>
-      <w:r>
-        <w:t xml:space="preserve">Les courriels ne contiennent</w:t>
-      </w:r>
-      <w:r>
-        <w:t xml:space="preserve"> </w:t>
-      </w:r>
-      <w:r>
-        <w:rPr>
-          <w:bCs/>
-          <w:b/>
-        </w:rPr>
-        <w:t xml:space="preserve">jamais</w:t>
-      </w:r>
-      <w:r>
-        <w:t xml:space="preserve"> </w:t>
-      </w:r>
-      <w:r>
-        <w:t xml:space="preserve">de cote, de commentaire ni d’évaluation.</w:t>
-      </w:r>
-    </w:p>
-    <w:p>
-      <w:pPr>
-        <w:numPr>
-          <w:ilvl w:val="0"/>
+          <w:ilvl w:val="1"/>
           <w:numId w:val="1014"/>
         </w:numPr>
         <w:pStyle w:val="Compact"/>
@@ -5256,31 +5194,19 @@
           <w:bCs/>
           <w:b/>
         </w:rPr>
-        <w:t xml:space="preserve">Avis au supérieur</w:t>
-      </w:r>
-      <w:r>
-        <w:t xml:space="preserve"> </w:t>
-      </w:r>
-      <w:r>
-        <w:t xml:space="preserve">— Objet :</w:t>
-      </w:r>
-      <w:r>
-        <w:t xml:space="preserve"> </w:t>
-      </w:r>
-      <w:r>
-        <w:rPr>
-          <w:rStyle w:val="VerbatimChar"/>
-        </w:rPr>
-        <w:t xml:space="preserve">Appréciation de la contribution — dossier prêt pour votre lecture</w:t>
-      </w:r>
-      <w:r>
-        <w:t xml:space="preserve">. Texte : « Bonjour, [nom de la personne] a complété sa partie du formulaire d’appréciation. Ouvrez « Mes dossiers » (lien de la bibliothèque Dossiers_Appreciations), puis chargez le dossier dans l’application (lien de la bibliothèque de l’application). »</w:t>
+        <w:t xml:space="preserve">Si oui</w:t>
+      </w:r>
+      <w:r>
+        <w:t xml:space="preserve"> </w:t>
+      </w:r>
+      <w:r>
+        <w:t xml:space="preserve">: courriel « Dépôt accepté » au déposant.</w:t>
       </w:r>
     </w:p>
     <w:p>
       <w:pPr>
         <w:numPr>
-          <w:ilvl w:val="0"/>
+          <w:ilvl w:val="1"/>
           <w:numId w:val="1014"/>
         </w:numPr>
         <w:pStyle w:val="Compact"/>
@@ -5290,32 +5216,20 @@
           <w:bCs/>
           <w:b/>
         </w:rPr>
-        <w:t xml:space="preserve">Approbation requise</w:t>
-      </w:r>
-      <w:r>
-        <w:t xml:space="preserve"> </w:t>
-      </w:r>
-      <w:r>
-        <w:t xml:space="preserve">— Objet :</w:t>
-      </w:r>
-      <w:r>
-        <w:t xml:space="preserve"> </w:t>
-      </w:r>
-      <w:r>
-        <w:rPr>
-          <w:rStyle w:val="VerbatimChar"/>
-        </w:rPr>
-        <w:t xml:space="preserve">Appréciation de la contribution — votre approbation est requise</w:t>
-      </w:r>
-      <w:r>
-        <w:t xml:space="preserve">. Texte : « Bonjour, le dossier d’appréciation de [nom] attend votre approbation. Ouvrez l’application, cochez votre rôle, chargez le dossier depuis « Mes dossiers », cochez « J’approuve » et déposez. »</w:t>
+        <w:t xml:space="preserve">Si non</w:t>
+      </w:r>
+      <w:r>
+        <w:t xml:space="preserve"> </w:t>
+      </w:r>
+      <w:r>
+        <w:t xml:space="preserve">: courriel « Dépôt refusé » au déposant.</w:t>
       </w:r>
     </w:p>
     <w:p>
       <w:pPr>
         <w:numPr>
           <w:ilvl w:val="0"/>
-          <w:numId w:val="1014"/>
+          <w:numId w:val="1013"/>
         </w:numPr>
         <w:pStyle w:val="Compact"/>
       </w:pPr>
@@ -5324,32 +5238,112 @@
           <w:bCs/>
           <w:b/>
         </w:rPr>
-        <w:t xml:space="preserve">Toutes les approbations sont obtenues</w:t>
-      </w:r>
-      <w:r>
-        <w:t xml:space="preserve"> </w:t>
-      </w:r>
-      <w:r>
-        <w:t xml:space="preserve">— Objet :</w:t>
-      </w:r>
-      <w:r>
-        <w:t xml:space="preserve"> </w:t>
-      </w:r>
-      <w:r>
-        <w:rPr>
-          <w:rStyle w:val="VerbatimChar"/>
-        </w:rPr>
-        <w:t xml:space="preserve">Appréciation de la contribution — approbations complétées</w:t>
-      </w:r>
-      <w:r>
-        <w:t xml:space="preserve">.</w:t>
+        <w:t xml:space="preserve">Supprimer l’élément de dépôt.</w:t>
+      </w:r>
+      <w:r>
+        <w:t xml:space="preserve"> </w:t>
+      </w:r>
+      <w:r>
+        <w:t xml:space="preserve">Action SharePoint</w:t>
+      </w:r>
+      <w:r>
+        <w:t xml:space="preserve"> </w:t>
+      </w:r>
+      <w:r>
+        <w:rPr>
+          <w:bCs/>
+          <w:b/>
+        </w:rPr>
+        <w:t xml:space="preserve">Supprimer l’élément</w:t>
+      </w:r>
+      <w:r>
+        <w:t xml:space="preserve">, liste Depot_Appreciations, Id =</w:t>
+      </w:r>
+      <w:r>
+        <w:t xml:space="preserve"> </w:t>
+      </w:r>
+      <w:r>
+        <w:rPr>
+          <w:bCs/>
+          <w:b/>
+        </w:rPr>
+        <w:t xml:space="preserve">ID</w:t>
+      </w:r>
+      <w:r>
+        <w:t xml:space="preserve"> </w:t>
+      </w:r>
+      <w:r>
+        <w:t xml:space="preserve">du déclencheur. Dans</w:t>
+      </w:r>
+      <w:r>
+        <w:t xml:space="preserve"> </w:t>
+      </w:r>
+      <w:r>
+        <w:rPr>
+          <w:bCs/>
+          <w:b/>
+        </w:rPr>
+        <w:t xml:space="preserve">Configurer l’exécution après</w:t>
+      </w:r>
+      <w:r>
+        <w:t xml:space="preserve">, cochez</w:t>
+      </w:r>
+      <w:r>
+        <w:t xml:space="preserve"> </w:t>
+      </w:r>
+      <w:r>
+        <w:rPr>
+          <w:bCs/>
+          <w:b/>
+        </w:rPr>
+        <w:t xml:space="preserve">toutes</w:t>
+      </w:r>
+      <w:r>
+        <w:t xml:space="preserve"> </w:t>
+      </w:r>
+      <w:r>
+        <w:t xml:space="preserve">les cases.</w:t>
+      </w:r>
+    </w:p>
+    <w:bookmarkEnd w:id="30"/>
+    <w:bookmarkStart w:id="31" w:name="Xf00ff7754150d667c16f762d88d2a763dc1d03c"/>
+    <w:p>
+      <w:pPr>
+        <w:pStyle w:val="Heading2"/>
+      </w:pPr>
+      <w:r>
+        <w:t xml:space="preserve">8. Les courriels (Office 365 Outlook — Envoyer un courriel (V2))</w:t>
+      </w:r>
+    </w:p>
+    <w:p>
+      <w:pPr>
+        <w:pStyle w:val="FirstParagraph"/>
+      </w:pPr>
+      <w:r>
+        <w:t xml:space="preserve">Les courriels ne contiennent</w:t>
+      </w:r>
+      <w:r>
+        <w:t xml:space="preserve"> </w:t>
+      </w:r>
+      <w:r>
+        <w:rPr>
+          <w:bCs/>
+          <w:b/>
+        </w:rPr>
+        <w:t xml:space="preserve">jamais</w:t>
+      </w:r>
+      <w:r>
+        <w:t xml:space="preserve"> </w:t>
+      </w:r>
+      <w:r>
+        <w:t xml:space="preserve">de cote, de commentaire ni d’évaluation.</w:t>
       </w:r>
     </w:p>
     <w:p>
       <w:pPr>
         <w:numPr>
           <w:ilvl w:val="0"/>
-          <w:numId w:val="1014"/>
+          <w:numId w:val="1015"/>
         </w:numPr>
         <w:pStyle w:val="Compact"/>
       </w:pPr>
@@ -5358,7 +5352,7 @@
           <w:bCs/>
           <w:b/>
         </w:rPr>
-        <w:t xml:space="preserve">Dépôt accepté</w:t>
+        <w:t xml:space="preserve">Avis au supérieur</w:t>
       </w:r>
       <w:r>
         <w:t xml:space="preserve"> </w:t>
@@ -5373,29 +5367,131 @@
         <w:rPr>
           <w:rStyle w:val="VerbatimChar"/>
         </w:rPr>
-        <w:t xml:space="preserve">Appréciation de la contribution — dépôt accepté</w:t>
-      </w:r>
-      <w:r>
-        <w:t xml:space="preserve">. Texte :</w:t>
-      </w:r>
-      <w:r>
-        <w:t xml:space="preserve"> </w:t>
-      </w:r>
-      <w:r>
-        <w:rPr>
-          <w:rStyle w:val="VerbatimChar"/>
-        </w:rPr>
-        <w:t xml:space="preserve">variables('message')</w:t>
-      </w:r>
-      <w:r>
-        <w:t xml:space="preserve">, puis « Rechargez la version officielle depuis « Mes dossiers » avant de continuer. »</w:t>
+        <w:t xml:space="preserve">Appréciation de la contribution — dossier prêt pour votre lecture</w:t>
+      </w:r>
+      <w:r>
+        <w:t xml:space="preserve">. Texte : « Bonjour, [nom de la personne] a complété sa partie du formulaire d’appréciation. Ouvrez « Mes dossiers » (lien de la bibliothèque Dossiers_Appreciations), puis chargez le dossier dans l’application (lien de la bibliothèque de l’application). »</w:t>
       </w:r>
     </w:p>
     <w:p>
       <w:pPr>
         <w:numPr>
           <w:ilvl w:val="0"/>
-          <w:numId w:val="1014"/>
+          <w:numId w:val="1015"/>
+        </w:numPr>
+        <w:pStyle w:val="Compact"/>
+      </w:pPr>
+      <w:r>
+        <w:rPr>
+          <w:bCs/>
+          <w:b/>
+        </w:rPr>
+        <w:t xml:space="preserve">Approbation requise</w:t>
+      </w:r>
+      <w:r>
+        <w:t xml:space="preserve"> </w:t>
+      </w:r>
+      <w:r>
+        <w:t xml:space="preserve">— Objet :</w:t>
+      </w:r>
+      <w:r>
+        <w:t xml:space="preserve"> </w:t>
+      </w:r>
+      <w:r>
+        <w:rPr>
+          <w:rStyle w:val="VerbatimChar"/>
+        </w:rPr>
+        <w:t xml:space="preserve">Appréciation de la contribution — votre approbation est requise</w:t>
+      </w:r>
+      <w:r>
+        <w:t xml:space="preserve">. Texte : « Bonjour, le dossier d’appréciation de [nom] attend votre approbation. Ouvrez l’application, cochez votre rôle, chargez le dossier depuis « Mes dossiers », cochez « J’approuve » et déposez. »</w:t>
+      </w:r>
+    </w:p>
+    <w:p>
+      <w:pPr>
+        <w:numPr>
+          <w:ilvl w:val="0"/>
+          <w:numId w:val="1015"/>
+        </w:numPr>
+        <w:pStyle w:val="Compact"/>
+      </w:pPr>
+      <w:r>
+        <w:rPr>
+          <w:bCs/>
+          <w:b/>
+        </w:rPr>
+        <w:t xml:space="preserve">Toutes les approbations sont obtenues</w:t>
+      </w:r>
+      <w:r>
+        <w:t xml:space="preserve"> </w:t>
+      </w:r>
+      <w:r>
+        <w:t xml:space="preserve">— Objet :</w:t>
+      </w:r>
+      <w:r>
+        <w:t xml:space="preserve"> </w:t>
+      </w:r>
+      <w:r>
+        <w:rPr>
+          <w:rStyle w:val="VerbatimChar"/>
+        </w:rPr>
+        <w:t xml:space="preserve">Appréciation de la contribution — approbations complétées</w:t>
+      </w:r>
+      <w:r>
+        <w:t xml:space="preserve">.</w:t>
+      </w:r>
+    </w:p>
+    <w:p>
+      <w:pPr>
+        <w:numPr>
+          <w:ilvl w:val="0"/>
+          <w:numId w:val="1015"/>
+        </w:numPr>
+        <w:pStyle w:val="Compact"/>
+      </w:pPr>
+      <w:r>
+        <w:rPr>
+          <w:bCs/>
+          <w:b/>
+        </w:rPr>
+        <w:t xml:space="preserve">Dépôt accepté</w:t>
+      </w:r>
+      <w:r>
+        <w:t xml:space="preserve"> </w:t>
+      </w:r>
+      <w:r>
+        <w:t xml:space="preserve">— Objet :</w:t>
+      </w:r>
+      <w:r>
+        <w:t xml:space="preserve"> </w:t>
+      </w:r>
+      <w:r>
+        <w:rPr>
+          <w:rStyle w:val="VerbatimChar"/>
+        </w:rPr>
+        <w:t xml:space="preserve">Appréciation de la contribution — dépôt accepté</w:t>
+      </w:r>
+      <w:r>
+        <w:t xml:space="preserve">. Texte :</w:t>
+      </w:r>
+      <w:r>
+        <w:t xml:space="preserve"> </w:t>
+      </w:r>
+      <w:r>
+        <w:rPr>
+          <w:rStyle w:val="VerbatimChar"/>
+        </w:rPr>
+        <w:t xml:space="preserve">variables('message')</w:t>
+      </w:r>
+      <w:r>
+        <w:t xml:space="preserve">, puis « Rechargez la version officielle depuis « Mes dossiers » avant de continuer. »</w:t>
+      </w:r>
+    </w:p>
+    <w:p>
+      <w:pPr>
+        <w:numPr>
+          <w:ilvl w:val="0"/>
+          <w:numId w:val="1015"/>
         </w:numPr>
         <w:pStyle w:val="Compact"/>
       </w:pPr>
@@ -6204,7 +6300,7 @@
       <w:pPr>
         <w:numPr>
           <w:ilvl w:val="0"/>
-          <w:numId w:val="1015"/>
+          <w:numId w:val="1016"/>
         </w:numPr>
         <w:pStyle w:val="Compact"/>
       </w:pPr>
@@ -6232,7 +6328,7 @@
       <w:pPr>
         <w:numPr>
           <w:ilvl w:val="0"/>
-          <w:numId w:val="1015"/>
+          <w:numId w:val="1016"/>
         </w:numPr>
         <w:pStyle w:val="Compact"/>
       </w:pPr>
@@ -6254,7 +6350,7 @@
       <w:pPr>
         <w:numPr>
           <w:ilvl w:val="0"/>
-          <w:numId w:val="1015"/>
+          <w:numId w:val="1016"/>
         </w:numPr>
         <w:pStyle w:val="Compact"/>
       </w:pPr>
@@ -6266,7 +6362,7 @@
       <w:pPr>
         <w:numPr>
           <w:ilvl w:val="0"/>
-          <w:numId w:val="1015"/>
+          <w:numId w:val="1016"/>
         </w:numPr>
         <w:pStyle w:val="Compact"/>
       </w:pPr>
@@ -6320,7 +6416,7 @@
       <w:pPr>
         <w:numPr>
           <w:ilvl w:val="0"/>
-          <w:numId w:val="1015"/>
+          <w:numId w:val="1016"/>
         </w:numPr>
         <w:pStyle w:val="Compact"/>
       </w:pPr>
@@ -6358,7 +6454,7 @@
       <w:pPr>
         <w:numPr>
           <w:ilvl w:val="0"/>
-          <w:numId w:val="1015"/>
+          <w:numId w:val="1016"/>
         </w:numPr>
         <w:pStyle w:val="Compact"/>
       </w:pPr>
@@ -6878,6 +6974,9 @@
     </w:lvlOverride>
   </w:num>
   <w:num w:numId="1006">
+    <w:abstractNumId w:val="991"/>
+  </w:num>
+  <w:num w:numId="1007">
     <w:abstractNumId w:val="99412"/>
     <w:lvlOverride w:ilvl="0">
       <w:startOverride w:val="2"/>
@@ -6907,7 +7006,7 @@
       <w:startOverride w:val="2"/>
     </w:lvlOverride>
   </w:num>
-  <w:num w:numId="1007">
+  <w:num w:numId="1008">
     <w:abstractNumId w:val="99413"/>
     <w:lvlOverride w:ilvl="0">
       <w:startOverride w:val="3"/>
@@ -6937,10 +7036,10 @@
       <w:startOverride w:val="3"/>
     </w:lvlOverride>
   </w:num>
-  <w:num w:numId="1008">
+  <w:num w:numId="1009">
     <w:abstractNumId w:val="991"/>
   </w:num>
-  <w:num w:numId="1009">
+  <w:num w:numId="1010">
     <w:abstractNumId w:val="99412"/>
     <w:lvlOverride w:ilvl="0">
       <w:startOverride w:val="2"/>
@@ -6970,13 +7069,13 @@
       <w:startOverride w:val="2"/>
     </w:lvlOverride>
   </w:num>
-  <w:num w:numId="1010">
-    <w:abstractNumId w:val="991"/>
-  </w:num>
   <w:num w:numId="1011">
     <w:abstractNumId w:val="991"/>
   </w:num>
   <w:num w:numId="1012">
+    <w:abstractNumId w:val="991"/>
+  </w:num>
+  <w:num w:numId="1013">
     <w:abstractNumId w:val="99411"/>
     <w:lvlOverride w:ilvl="0">
       <w:startOverride w:val="1"/>
@@ -7006,13 +7105,13 @@
       <w:startOverride w:val="1"/>
     </w:lvlOverride>
   </w:num>
-  <w:num w:numId="1013">
-    <w:abstractNumId w:val="991"/>
-  </w:num>
   <w:num w:numId="1014">
     <w:abstractNumId w:val="991"/>
   </w:num>
   <w:num w:numId="1015">
+    <w:abstractNumId w:val="991"/>
+  </w:num>
+  <w:num w:numId="1016">
     <w:abstractNumId w:val="991"/>
   </w:num>
 </w:numbering>

</xml_diff>